<commit_message>
T-0085 landing: rebuild the working-with-codex guide (HTML, DOCX, PDF) from the merged source
</commit_message>
<xml_diff>
--- a/docs/guides/crew/crew-1.0-working-with-codex.docx
+++ b/docs/guides/crew/crew-1.0-working-with-codex.docx
@@ -996,6 +996,68 @@
       <w:r>
         <w:rPr/>
         <w:t>A review that exits non-zero or prints nothing is INCOMPLETE, never CLEAN.</w:t>
+      </w:r>
+    </w:p>
+    <w:p>
+      <w:pPr>
+        <w:pStyle w:val="BodyText"/>
+        <w:bidi w:val="0"/>
+        <w:jc w:val="left"/>
+        <w:rPr/>
+      </w:pPr>
+      <w:r>
+        <w:rPr/>
+        <w:t xml:space="preserve">The review prompt Codex reads ends with a </w:t>
+      </w:r>
+      <w:r>
+        <w:rPr>
+          <w:rStyle w:val="Strong"/>
+        </w:rPr>
+        <w:t>development standards checklist</w:t>
+      </w:r>
+      <w:r>
+        <w:rPr/>
+        <w:t xml:space="preserve">: the rules and self-check questions of every standard that applies to the change (crew's generic set, any matching per-language set, and the repository's </w:t>
+      </w:r>
+      <w:r>
+        <w:rPr>
+          <w:rStyle w:val="SourceText"/>
+        </w:rPr>
+        <w:t>.crew/standards.md</w:t>
+      </w:r>
+      <w:r>
+        <w:rPr/>
+        <w:t xml:space="preserve"> overlay). The author's own self-check answers are withheld from the prompt, so Codex judges each standard's applicability itself, and the prompt says the list does not bound the review: a defect outside it is reported the same way. Withheld from the prompt is not hidden: the answers stay in </w:t>
+      </w:r>
+      <w:r>
+        <w:rPr>
+          <w:rStyle w:val="SourceText"/>
+        </w:rPr>
+        <w:t>.work/tickets/&lt;id&gt;/selfcheck.md</w:t>
+      </w:r>
+      <w:r>
+        <w:rPr/>
+        <w:t xml:space="preserve">, which Codex, with read access to the checkout, could open; the prompt never names that file. For a ticket with an approval receipt (or one whose receipt cannot be proven absent), </w:t>
+      </w:r>
+      <w:r>
+        <w:rPr>
+          <w:rStyle w:val="SourceText"/>
+        </w:rPr>
+        <w:t>review_run.py</w:t>
+      </w:r>
+      <w:r>
+        <w:rPr/>
+        <w:t xml:space="preserve"> will not launch Codex, or reserve a round, until the author's self-check is complete and stamped for the exact bundle Codex is about to read. A ticket with no approval receipt is told the gate does not apply, and during a declared incident (</w:t>
+      </w:r>
+      <w:r>
+        <w:rPr>
+          <w:rStyle w:val="SourceText"/>
+        </w:rPr>
+        <w:t>/crew:emergency</w:t>
+      </w:r>
+      <w:r>
+        <w:rPr/>
+        <w:t>) the gate stands down and logs the skip. The self-check is asked for last: a CLEAN receipt that already covers the bundle answers CLEAN without it, and a tree the verify gate has not passed is refused (exit 5) before it.</w:t>
       </w:r>
     </w:p>
     <w:p>

</xml_diff>

<commit_message>
L-0574: working-with-codex guide describes the pre-review checks; HTML, DOCX and PDF rebuilt with build.py (LibreOffice)
</commit_message>
<xml_diff>
--- a/docs/guides/crew/crew-1.0-working-with-codex.docx
+++ b/docs/guides/crew/crew-1.0-working-with-codex.docx
@@ -1088,6 +1088,98 @@
       <w:r>
         <w:rPr/>
         <w:t>) the gate stands down and logs the skip. The self-check is asked for last: a CLEAN receipt that already covers the bundle answers CLEAN without it, and a tree the verify gate has not passed is refused (exit 5) before it.</w:t>
+      </w:r>
+    </w:p>
+    <w:p>
+      <w:pPr>
+        <w:pStyle w:val="BodyText"/>
+        <w:bidi w:val="0"/>
+        <w:jc w:val="left"/>
+        <w:rPr/>
+      </w:pPr>
+      <w:r>
+        <w:rPr/>
+        <w:t xml:space="preserve">Between the verify gate and the self-check, </w:t>
+      </w:r>
+      <w:r>
+        <w:rPr>
+          <w:rStyle w:val="SourceText"/>
+        </w:rPr>
+        <w:t>review_run.py</w:t>
+      </w:r>
+      <w:r>
+        <w:rPr/>
+        <w:t xml:space="preserve"> lints the bundle's changed files with the linters </w:t>
+      </w:r>
+      <w:r>
+        <w:rPr>
+          <w:rStyle w:val="SourceText"/>
+        </w:rPr>
+        <w:t>.crew/verify.json</w:t>
+      </w:r>
+      <w:r>
+        <w:rPr/>
+        <w:t xml:space="preserve"> lists under </w:t>
+      </w:r>
+      <w:r>
+        <w:rPr>
+          <w:rStyle w:val="SourceText"/>
+        </w:rPr>
+        <w:t>preReview</w:t>
+      </w:r>
+      <w:r>
+        <w:rPr/>
+        <w:t xml:space="preserve"> (L-0574). Each file is linted at its base and at the bundle, and a finding the bundle adds refuses the round (exit 5, nothing spent) before Codex is launched. </w:t>
+      </w:r>
+      <w:r>
+        <w:rPr>
+          <w:rStyle w:val="SourceText"/>
+        </w:rPr>
+        <w:t>--allow-unverified</w:t>
+      </w:r>
+      <w:r>
+        <w:rPr/>
+        <w:t xml:space="preserve"> does not override a new finding. A linter that could not run, or could not parse a changed file, reads </w:t>
+      </w:r>
+      <w:r>
+        <w:rPr>
+          <w:rStyle w:val="SourceText"/>
+        </w:rPr>
+        <w:t>COULD NOT CHECK</w:t>
+      </w:r>
+      <w:r>
+        <w:rPr/>
+        <w:t xml:space="preserve">, never a pass. It refuses too, unless </w:t>
+      </w:r>
+      <w:r>
+        <w:rPr>
+          <w:rStyle w:val="SourceText"/>
+        </w:rPr>
+        <w:t>--allow-unverified</w:t>
+      </w:r>
+      <w:r>
+        <w:rPr/>
+        <w:t xml:space="preserve"> is given, and </w:t>
+      </w:r>
+      <w:r>
+        <w:rPr>
+          <w:rStyle w:val="SourceText"/>
+        </w:rPr>
+        <w:t>review.json</w:t>
+      </w:r>
+      <w:r>
+        <w:rPr/>
+        <w:t xml:space="preserve"> records that override as </w:t>
+      </w:r>
+      <w:r>
+        <w:rPr>
+          <w:rStyle w:val="SourceText"/>
+        </w:rPr>
+        <w:t>prereview.overridden</w:t>
+      </w:r>
+      <w:r>
+        <w:rPr/>
+        <w:t>.</w:t>
       </w:r>
     </w:p>
     <w:p>

</xml_diff>

<commit_message>
L-0601: the recurring-findings checklist in the shared review prompt, with its sabotage entries
- review_prompt.build appends recurring_findings.review_block after the
  standards checklist and before the web tests; tests pin the three-header
  order (with a forced web-test block), the scoping and the UNKNOWN case.
- sabotage_recurring.py: seventeen entries (L-0575's checklist guards
  re-anchored, L-0592's eight fixes, the prompt dropping the block), each
  red on its named test; appended to sabotage.py's MUTATIONS.
- verify.json's recurring-findings rule also covers review_prompt.py and
  sabotage_recurring.py and runs test_review_prompt.py.
- review.md's contract comment (same lines), README, working-with-codex
  guide (rebuilt), crew code map, lifecycle diagram, CHANGELOG.

Claude-Session: https://claude.ai/code/session_01XqPLTy3rVKZ7QKRsp5snXv
</commit_message>
<xml_diff>
--- a/docs/guides/crew/crew-1.0-working-with-codex.docx
+++ b/docs/guides/crew/crew-1.0-working-with-codex.docx
@@ -1088,6 +1088,48 @@
       <w:r>
         <w:rPr/>
         <w:t>) the gate stands down and logs the skip. The self-check is asked for last: a CLEAN receipt that already covers the bundle answers CLEAN without it, and a tree the verify gate has not passed is refused (exit 5) before it.</w:t>
+      </w:r>
+    </w:p>
+    <w:p>
+      <w:pPr>
+        <w:pStyle w:val="BodyText"/>
+        <w:bidi w:val="0"/>
+        <w:jc w:val="left"/>
+        <w:rPr/>
+      </w:pPr>
+      <w:r>
+        <w:rPr/>
+        <w:t xml:space="preserve">After the standards checklist comes the </w:t>
+      </w:r>
+      <w:r>
+        <w:rPr>
+          <w:rStyle w:val="Strong"/>
+        </w:rPr>
+        <w:t>recurring-findings checklist</w:t>
+      </w:r>
+      <w:r>
+        <w:rPr/>
+        <w:t xml:space="preserve">: the defect classes earlier reviews kept finding (processes and races, claims not true at the commit, tests that cannot fail, fail-open handling, PowerShell/Bash drift, guard bypass, version and registration), only those whose path globs meet the files the diff changes, a few probes each. It is the same list </w:t>
+      </w:r>
+      <w:r>
+        <w:rPr>
+          <w:rStyle w:val="SourceText"/>
+        </w:rPr>
+        <w:t>/crew:implement</w:t>
+      </w:r>
+      <w:r>
+        <w:rPr/>
+        <w:t xml:space="preserve"> showed the developer before the first plan step. It does not bound the review, and an item the diff does not touch is not a finding. When the bundle's manifest cannot say which files changed, every class is listed under an </w:t>
+      </w:r>
+      <w:r>
+        <w:rPr>
+          <w:rStyle w:val="SourceText"/>
+        </w:rPr>
+        <w:t>UNKNOWN:</w:t>
+      </w:r>
+      <w:r>
+        <w:rPr/>
+        <w:t xml:space="preserve"> line rather than none.</w:t>
       </w:r>
     </w:p>
     <w:p>

</xml_diff>

<commit_message>
H1: docs, guide outputs, code map and rules; remove the ticket folders
README, troubleshooting and working-with-codex guides (HTML, DOCX, PDF
rebuilt), review.md step 3 rewritten in place (548 lines, unchanged),
code map entries, CHANGELOG, regenerated rules. The specs ship as code and
CHANGELOG; docs/tickets/T-0098, T-0109 and T-0101 are removed.

Claude-Session: https://claude.ai/code/session_016wQA2o38aSB65bpjaGpMVJ
</commit_message>
<xml_diff>
--- a/docs/guides/crew/crew-1.0-working-with-codex.docx
+++ b/docs/guides/crew/crew-1.0-working-with-codex.docx
@@ -1221,7 +1221,67 @@
       </w:r>
       <w:r>
         <w:rPr/>
-        <w:t>.</w:t>
+        <w:t xml:space="preserve">. When the verify gate has not passed the tree, the prompt's test receipts keep their </w:t>
+      </w:r>
+      <w:r>
+        <w:rPr>
+          <w:rStyle w:val="SourceText"/>
+        </w:rPr>
+        <w:t>MISSING</w:t>
+      </w:r>
+      <w:r>
+        <w:rPr/>
+        <w:t xml:space="preserve"> and </w:t>
+      </w:r>
+      <w:r>
+        <w:rPr>
+          <w:rStyle w:val="SourceText"/>
+        </w:rPr>
+        <w:t>Gate answer for HEAD</w:t>
+      </w:r>
+      <w:r>
+        <w:rPr/>
+        <w:t xml:space="preserve"> lines and add one line saying such a round runs only under </w:t>
+      </w:r>
+      <w:r>
+        <w:rPr>
+          <w:rStyle w:val="SourceText"/>
+        </w:rPr>
+        <w:t>--allow-unverified</w:t>
+      </w:r>
+      <w:r>
+        <w:rPr/>
+        <w:t xml:space="preserve">, recorded as </w:t>
+      </w:r>
+      <w:r>
+        <w:rPr>
+          <w:rStyle w:val="SourceText"/>
+        </w:rPr>
+        <w:t>gate.overridden</w:t>
+      </w:r>
+      <w:r>
+        <w:rPr/>
+        <w:t xml:space="preserve"> in </w:t>
+      </w:r>
+      <w:r>
+        <w:rPr>
+          <w:rStyle w:val="SourceText"/>
+        </w:rPr>
+        <w:t>review.json</w:t>
+      </w:r>
+      <w:r>
+        <w:rPr/>
+        <w:t xml:space="preserve">, that </w:t>
+      </w:r>
+      <w:r>
+        <w:rPr>
+          <w:rStyle w:val="SourceText"/>
+        </w:rPr>
+        <w:t>/crew:done</w:t>
+      </w:r>
+      <w:r>
+        <w:rPr/>
+        <w:t xml:space="preserve"> still needs a clean gate, and that the missing pass alone is that recorded override, not a defect (T-0101).</w:t>
       </w:r>
     </w:p>
     <w:p>

</xml_diff>